<commit_message>
Experiment 2: RandomForest depth 20
</commit_message>
<xml_diff>
--- a/2022bcs0187_Mlops_Lab2.docx
+++ b/2022bcs0187_Mlops_Lab2.docx
@@ -61,18 +61,8 @@
           <w:sz w:val="48"/>
           <w:szCs w:val="48"/>
         </w:rPr>
-        <w:t xml:space="preserve">Name :- Chodvadiya Sujal </w:t>
+        <w:t>Name :- Chodvadiya Sujal Hasmukhbhai</w:t>
       </w:r>
-      <w:proofErr w:type="spellStart"/>
-      <w:r>
-        <w:rPr>
-          <w:rStyle w:val="IntenseReference"/>
-          <w:sz w:val="48"/>
-          <w:szCs w:val="48"/>
-        </w:rPr>
-        <w:t>Hasmukhbhai</w:t>
-      </w:r>
-      <w:proofErr w:type="spellEnd"/>
     </w:p>
     <w:p>
       <w:pPr>
@@ -233,33 +223,7 @@
           <w:szCs w:val="40"/>
         </w:rPr>
         <w:lastRenderedPageBreak/>
-        <w:t xml:space="preserve">GitHub repository link (with </w:t>
-      </w:r>
-      <w:proofErr w:type="spellStart"/>
-      <w:r>
-        <w:rPr>
-          <w:b/>
-          <w:bCs/>
-          <w:smallCaps/>
-          <w:color w:val="830F0E" w:themeColor="accent1" w:themeShade="BF"/>
-          <w:spacing w:val="5"/>
-          <w:sz w:val="40"/>
-          <w:szCs w:val="40"/>
-        </w:rPr>
-        <w:t>Jenkinsfile</w:t>
-      </w:r>
-      <w:proofErr w:type="spellEnd"/>
-      <w:r>
-        <w:rPr>
-          <w:b/>
-          <w:bCs/>
-          <w:smallCaps/>
-          <w:color w:val="830F0E" w:themeColor="accent1" w:themeShade="BF"/>
-          <w:spacing w:val="5"/>
-          <w:sz w:val="40"/>
-          <w:szCs w:val="40"/>
-        </w:rPr>
-        <w:t>)</w:t>
+        <w:t>GitHub repository link (with Jenkinsfile)</w:t>
       </w:r>
       <w:r>
         <w:rPr>
@@ -328,6 +292,62 @@
           <w:szCs w:val="32"/>
         </w:rPr>
         <w:t xml:space="preserve">Job summary with metrics for all experiments </w:t>
+      </w:r>
+    </w:p>
+    <w:p>
+      <w:pPr>
+        <w:ind w:left="1080"/>
+        <w:rPr>
+          <w:smallCaps/>
+          <w:color w:val="EE0000"/>
+          <w:spacing w:val="5"/>
+          <w:sz w:val="32"/>
+          <w:szCs w:val="32"/>
+        </w:rPr>
+      </w:pPr>
+      <w:r>
+        <w:rPr>
+          <w:smallCaps/>
+          <w:color w:val="EE0000"/>
+          <w:spacing w:val="5"/>
+          <w:sz w:val="32"/>
+          <w:szCs w:val="32"/>
+        </w:rPr>
+        <w:drawing>
+          <wp:inline distT="0" distB="0" distL="0" distR="0" wp14:anchorId="28EAF94D" wp14:editId="0092DAA4">
+            <wp:extent cx="5731510" cy="2453005"/>
+            <wp:effectExtent l="0" t="0" r="2540" b="4445"/>
+            <wp:docPr id="618659038" name="Picture 1"/>
+            <wp:cNvGraphicFramePr>
+              <a:graphicFrameLocks xmlns:a="http://schemas.openxmlformats.org/drawingml/2006/main" noChangeAspect="1"/>
+            </wp:cNvGraphicFramePr>
+            <a:graphic xmlns:a="http://schemas.openxmlformats.org/drawingml/2006/main">
+              <a:graphicData uri="http://schemas.openxmlformats.org/drawingml/2006/picture">
+                <pic:pic xmlns:pic="http://schemas.openxmlformats.org/drawingml/2006/picture">
+                  <pic:nvPicPr>
+                    <pic:cNvPr id="618659038" name=""/>
+                    <pic:cNvPicPr/>
+                  </pic:nvPicPr>
+                  <pic:blipFill>
+                    <a:blip r:embed="rId6"/>
+                    <a:stretch>
+                      <a:fillRect/>
+                    </a:stretch>
+                  </pic:blipFill>
+                  <pic:spPr>
+                    <a:xfrm>
+                      <a:off x="0" y="0"/>
+                      <a:ext cx="5731510" cy="2453005"/>
+                    </a:xfrm>
+                    <a:prstGeom prst="rect">
+                      <a:avLst/>
+                    </a:prstGeom>
+                  </pic:spPr>
+                </pic:pic>
+              </a:graphicData>
+            </a:graphic>
+          </wp:inline>
+        </w:drawing>
       </w:r>
     </w:p>
     <w:p>

</xml_diff>

<commit_message>
Experiment 3: Linear Regression
</commit_message>
<xml_diff>
--- a/2022bcs0187_Mlops_Lab2.docx
+++ b/2022bcs0187_Mlops_Lab2.docx
@@ -296,7 +296,6 @@
     </w:p>
     <w:p>
       <w:pPr>
-        <w:ind w:left="1080"/>
         <w:rPr>
           <w:smallCaps/>
           <w:color w:val="EE0000"/>
@@ -338,6 +337,61 @@
                     <a:xfrm>
                       <a:off x="0" y="0"/>
                       <a:ext cx="5731510" cy="2453005"/>
+                    </a:xfrm>
+                    <a:prstGeom prst="rect">
+                      <a:avLst/>
+                    </a:prstGeom>
+                  </pic:spPr>
+                </pic:pic>
+              </a:graphicData>
+            </a:graphic>
+          </wp:inline>
+        </w:drawing>
+      </w:r>
+    </w:p>
+    <w:p>
+      <w:pPr>
+        <w:rPr>
+          <w:smallCaps/>
+          <w:color w:val="EE0000"/>
+          <w:spacing w:val="5"/>
+          <w:sz w:val="32"/>
+          <w:szCs w:val="32"/>
+        </w:rPr>
+      </w:pPr>
+      <w:r>
+        <w:rPr>
+          <w:smallCaps/>
+          <w:color w:val="EE0000"/>
+          <w:spacing w:val="5"/>
+          <w:sz w:val="32"/>
+          <w:szCs w:val="32"/>
+        </w:rPr>
+        <w:drawing>
+          <wp:inline distT="0" distB="0" distL="0" distR="0" wp14:anchorId="75CEE082" wp14:editId="1B82CC23">
+            <wp:extent cx="5731510" cy="2759075"/>
+            <wp:effectExtent l="0" t="0" r="2540" b="3175"/>
+            <wp:docPr id="760932518" name="Picture 1"/>
+            <wp:cNvGraphicFramePr>
+              <a:graphicFrameLocks xmlns:a="http://schemas.openxmlformats.org/drawingml/2006/main" noChangeAspect="1"/>
+            </wp:cNvGraphicFramePr>
+            <a:graphic xmlns:a="http://schemas.openxmlformats.org/drawingml/2006/main">
+              <a:graphicData uri="http://schemas.openxmlformats.org/drawingml/2006/picture">
+                <pic:pic xmlns:pic="http://schemas.openxmlformats.org/drawingml/2006/picture">
+                  <pic:nvPicPr>
+                    <pic:cNvPr id="760932518" name=""/>
+                    <pic:cNvPicPr/>
+                  </pic:nvPicPr>
+                  <pic:blipFill>
+                    <a:blip r:embed="rId7"/>
+                    <a:stretch>
+                      <a:fillRect/>
+                    </a:stretch>
+                  </pic:blipFill>
+                  <pic:spPr>
+                    <a:xfrm>
+                      <a:off x="0" y="0"/>
+                      <a:ext cx="5731510" cy="2759075"/>
                     </a:xfrm>
                     <a:prstGeom prst="rect">
                       <a:avLst/>

</xml_diff>

<commit_message>
Experiment 4: Model: Ridge Regression, alpha=1.0
</commit_message>
<xml_diff>
--- a/2022bcs0187_Mlops_Lab2.docx
+++ b/2022bcs0187_Mlops_Lab2.docx
@@ -403,6 +403,73 @@
           </wp:inline>
         </w:drawing>
       </w:r>
+    </w:p>
+    <w:p>
+      <w:pPr>
+        <w:rPr>
+          <w:smallCaps/>
+          <w:color w:val="EE0000"/>
+          <w:spacing w:val="5"/>
+          <w:sz w:val="32"/>
+          <w:szCs w:val="32"/>
+        </w:rPr>
+      </w:pPr>
+      <w:r>
+        <w:rPr>
+          <w:smallCaps/>
+          <w:color w:val="EE0000"/>
+          <w:spacing w:val="5"/>
+          <w:sz w:val="32"/>
+          <w:szCs w:val="32"/>
+        </w:rPr>
+        <w:lastRenderedPageBreak/>
+        <w:drawing>
+          <wp:inline distT="0" distB="0" distL="0" distR="0" wp14:anchorId="79BEAD4A" wp14:editId="046CB6F3">
+            <wp:extent cx="5731510" cy="2472690"/>
+            <wp:effectExtent l="0" t="0" r="2540" b="3810"/>
+            <wp:docPr id="1378727455" name="Picture 1"/>
+            <wp:cNvGraphicFramePr>
+              <a:graphicFrameLocks xmlns:a="http://schemas.openxmlformats.org/drawingml/2006/main" noChangeAspect="1"/>
+            </wp:cNvGraphicFramePr>
+            <a:graphic xmlns:a="http://schemas.openxmlformats.org/drawingml/2006/main">
+              <a:graphicData uri="http://schemas.openxmlformats.org/drawingml/2006/picture">
+                <pic:pic xmlns:pic="http://schemas.openxmlformats.org/drawingml/2006/picture">
+                  <pic:nvPicPr>
+                    <pic:cNvPr id="1378727455" name=""/>
+                    <pic:cNvPicPr/>
+                  </pic:nvPicPr>
+                  <pic:blipFill>
+                    <a:blip r:embed="rId8"/>
+                    <a:stretch>
+                      <a:fillRect/>
+                    </a:stretch>
+                  </pic:blipFill>
+                  <pic:spPr>
+                    <a:xfrm>
+                      <a:off x="0" y="0"/>
+                      <a:ext cx="5731510" cy="2472690"/>
+                    </a:xfrm>
+                    <a:prstGeom prst="rect">
+                      <a:avLst/>
+                    </a:prstGeom>
+                  </pic:spPr>
+                </pic:pic>
+              </a:graphicData>
+            </a:graphic>
+          </wp:inline>
+        </w:drawing>
+      </w:r>
+    </w:p>
+    <w:p>
+      <w:pPr>
+        <w:rPr>
+          <w:smallCaps/>
+          <w:color w:val="EE0000"/>
+          <w:spacing w:val="5"/>
+          <w:sz w:val="32"/>
+          <w:szCs w:val="32"/>
+        </w:rPr>
+      </w:pPr>
     </w:p>
     <w:p>
       <w:pPr>

</xml_diff>

<commit_message>
Experiment 5: Model: GradientBoosting, n_estimators=200, learning_rate=0.05
</commit_message>
<xml_diff>
--- a/2022bcs0187_Mlops_Lab2.docx
+++ b/2022bcs0187_Mlops_Lab2.docx
@@ -448,6 +448,61 @@
                     <a:xfrm>
                       <a:off x="0" y="0"/>
                       <a:ext cx="5731510" cy="2472690"/>
+                    </a:xfrm>
+                    <a:prstGeom prst="rect">
+                      <a:avLst/>
+                    </a:prstGeom>
+                  </pic:spPr>
+                </pic:pic>
+              </a:graphicData>
+            </a:graphic>
+          </wp:inline>
+        </w:drawing>
+      </w:r>
+    </w:p>
+    <w:p>
+      <w:pPr>
+        <w:rPr>
+          <w:smallCaps/>
+          <w:color w:val="EE0000"/>
+          <w:spacing w:val="5"/>
+          <w:sz w:val="32"/>
+          <w:szCs w:val="32"/>
+        </w:rPr>
+      </w:pPr>
+      <w:r>
+        <w:rPr>
+          <w:smallCaps/>
+          <w:color w:val="EE0000"/>
+          <w:spacing w:val="5"/>
+          <w:sz w:val="32"/>
+          <w:szCs w:val="32"/>
+        </w:rPr>
+        <w:drawing>
+          <wp:inline distT="0" distB="0" distL="0" distR="0" wp14:anchorId="3A82F9E9" wp14:editId="16A4B80C">
+            <wp:extent cx="5731510" cy="2486025"/>
+            <wp:effectExtent l="0" t="0" r="2540" b="9525"/>
+            <wp:docPr id="874328639" name="Picture 1"/>
+            <wp:cNvGraphicFramePr>
+              <a:graphicFrameLocks xmlns:a="http://schemas.openxmlformats.org/drawingml/2006/main" noChangeAspect="1"/>
+            </wp:cNvGraphicFramePr>
+            <a:graphic xmlns:a="http://schemas.openxmlformats.org/drawingml/2006/main">
+              <a:graphicData uri="http://schemas.openxmlformats.org/drawingml/2006/picture">
+                <pic:pic xmlns:pic="http://schemas.openxmlformats.org/drawingml/2006/picture">
+                  <pic:nvPicPr>
+                    <pic:cNvPr id="874328639" name=""/>
+                    <pic:cNvPicPr/>
+                  </pic:nvPicPr>
+                  <pic:blipFill>
+                    <a:blip r:embed="rId9"/>
+                    <a:stretch>
+                      <a:fillRect/>
+                    </a:stretch>
+                  </pic:blipFill>
+                  <pic:spPr>
+                    <a:xfrm>
+                      <a:off x="0" y="0"/>
+                      <a:ext cx="5731510" cy="2486025"/>
                     </a:xfrm>
                     <a:prstGeom prst="rect">
                       <a:avLst/>

</xml_diff>